<commit_message>
updated pdf with gof participants
</commit_message>
<xml_diff>
--- a/COS214PRAC4_PDF.docx
+++ b/COS214PRAC4_PDF.docx
@@ -450,46 +450,52 @@
     <w:tbl>
       <w:tblPr>
         <w:tblStyle w:val="TableGrid"/>
-        <w:tblW w:w="0" w:type="auto"/>
+        <w:tblW w:w="9360" w:type="dxa"/>
         <w:tblLook w:val="04A0" w:firstRow="1" w:lastRow="0" w:firstColumn="1" w:lastColumn="0" w:noHBand="0" w:noVBand="1"/>
       </w:tblPr>
       <w:tblGrid>
-        <w:gridCol w:w="3005"/>
-        <w:gridCol w:w="3005"/>
-        <w:gridCol w:w="3006"/>
+        <w:gridCol w:w="1774"/>
+        <w:gridCol w:w="3911"/>
+        <w:gridCol w:w="3675"/>
       </w:tblGrid>
       <w:tr>
         <w:tc>
           <w:tcPr>
-            <w:tcW w:w="3005" w:type="dxa"/>
+            <w:tcW w:w="0" w:type="auto"/>
+            <w:hideMark/>
           </w:tcPr>
           <w:p>
             <w:pPr>
               <w:rPr>
-                <w:lang w:val="en-ZA"/>
+                <w:b/>
+                <w:bCs/>
               </w:rPr>
             </w:pPr>
             <w:r>
               <w:rPr>
-                <w:lang w:val="en-ZA"/>
+                <w:b/>
+                <w:bCs/>
               </w:rPr>
-              <w:t>ParticipantName</w:t>
-            </w:r>
-          </w:p>
-        </w:tc>
-        <w:tc>
-          <w:tcPr>
-            <w:tcW w:w="3005" w:type="dxa"/>
+              <w:t>Participant Name</w:t>
+            </w:r>
+          </w:p>
+        </w:tc>
+        <w:tc>
+          <w:tcPr>
+            <w:tcW w:w="0" w:type="auto"/>
+            <w:hideMark/>
           </w:tcPr>
           <w:p>
             <w:pPr>
               <w:rPr>
-                <w:lang w:val="en-ZA"/>
+                <w:b/>
+                <w:bCs/>
               </w:rPr>
             </w:pPr>
             <w:r>
               <w:rPr>
-                <w:lang w:val="en-ZA"/>
+                <w:b/>
+                <w:bCs/>
               </w:rPr>
               <w:t>Class</w:t>
             </w:r>
@@ -497,17 +503,20 @@
         </w:tc>
         <w:tc>
           <w:tcPr>
-            <w:tcW w:w="3006" w:type="dxa"/>
+            <w:tcW w:w="0" w:type="auto"/>
+            <w:hideMark/>
           </w:tcPr>
           <w:p>
             <w:pPr>
               <w:rPr>
-                <w:lang w:val="en-ZA"/>
+                <w:b/>
+                <w:bCs/>
               </w:rPr>
             </w:pPr>
             <w:r>
               <w:rPr>
-                <w:lang w:val="en-ZA"/>
+                <w:b/>
+                <w:bCs/>
               </w:rPr>
               <w:t>Description</w:t>
             </w:r>
@@ -517,102 +526,69 @@
       <w:tr>
         <w:tc>
           <w:tcPr>
-            <w:tcW w:w="3005" w:type="dxa"/>
-          </w:tcPr>
-          <w:p>
-            <w:pPr>
-              <w:rPr>
-                <w:lang w:val="en-ZA"/>
-              </w:rPr>
-            </w:pPr>
-            <w:r>
-              <w:rPr>
-                <w:lang w:val="en-ZA"/>
-              </w:rPr>
+            <w:tcW w:w="0" w:type="auto"/>
+            <w:hideMark/>
+          </w:tcPr>
+          <w:p>
+            <w:r>
               <w:t>Component</w:t>
             </w:r>
           </w:p>
         </w:tc>
         <w:tc>
           <w:tcPr>
-            <w:tcW w:w="3005" w:type="dxa"/>
-          </w:tcPr>
-          <w:p>
-            <w:pPr>
-              <w:rPr>
-                <w:lang w:val="en-ZA"/>
-              </w:rPr>
-            </w:pPr>
-            <w:r>
-              <w:rPr>
-                <w:lang w:val="en-ZA"/>
-              </w:rPr>
+            <w:tcW w:w="0" w:type="auto"/>
+            <w:hideMark/>
+          </w:tcPr>
+          <w:p>
+            <w:r>
               <w:t>DeliveryComponent</w:t>
             </w:r>
           </w:p>
         </w:tc>
         <w:tc>
           <w:tcPr>
-            <w:tcW w:w="3006" w:type="dxa"/>
-          </w:tcPr>
-          <w:p>
-            <w:pPr>
-              <w:rPr>
-                <w:lang w:val="en-ZA"/>
-              </w:rPr>
-            </w:pPr>
+            <w:tcW w:w="0" w:type="auto"/>
+            <w:hideMark/>
+          </w:tcPr>
+          <w:p>
+            <w:r>
+              <w:t>Common interface for phases and tasks.</w:t>
+            </w:r>
           </w:p>
         </w:tc>
       </w:tr>
       <w:tr>
         <w:tc>
           <w:tcPr>
-            <w:tcW w:w="3005" w:type="dxa"/>
-          </w:tcPr>
-          <w:p>
-            <w:pPr>
-              <w:rPr>
-                <w:lang w:val="en-ZA"/>
-              </w:rPr>
-            </w:pPr>
-            <w:r>
-              <w:rPr>
-                <w:lang w:val="en-ZA"/>
-              </w:rPr>
+            <w:tcW w:w="0" w:type="auto"/>
+            <w:hideMark/>
+          </w:tcPr>
+          <w:p>
+            <w:r>
               <w:t>Composite</w:t>
             </w:r>
           </w:p>
         </w:tc>
         <w:tc>
           <w:tcPr>
-            <w:tcW w:w="3005" w:type="dxa"/>
-          </w:tcPr>
-          <w:p>
-            <w:pPr>
-              <w:rPr>
-                <w:lang w:val="en-ZA"/>
-              </w:rPr>
-            </w:pPr>
-            <w:r>
-              <w:rPr>
-                <w:lang w:val="en-ZA"/>
-              </w:rPr>
+            <w:tcW w:w="0" w:type="auto"/>
+            <w:hideMark/>
+          </w:tcPr>
+          <w:p>
+            <w:r>
               <w:t>DeliveryPhase</w:t>
             </w:r>
           </w:p>
         </w:tc>
         <w:tc>
           <w:tcPr>
-            <w:tcW w:w="3006" w:type="dxa"/>
-          </w:tcPr>
-          <w:p>
-            <w:pPr>
-              <w:rPr>
-                <w:lang w:val="en-ZA"/>
-              </w:rPr>
-            </w:pPr>
-            <w:r>
-              <w:t>Represents a collection of related work.</w:t>
+            <w:tcW w:w="0" w:type="auto"/>
+            <w:hideMark/>
+          </w:tcPr>
+          <w:p>
+            <w:r>
+              <w:t>Can contain multiple DeliveryComponent objects.</w:t>
             </w:r>
           </w:p>
         </w:tc>
@@ -620,52 +596,215 @@
       <w:tr>
         <w:tc>
           <w:tcPr>
-            <w:tcW w:w="3005" w:type="dxa"/>
-          </w:tcPr>
-          <w:p>
-            <w:pPr>
-              <w:rPr>
-                <w:lang w:val="en-ZA"/>
-              </w:rPr>
-            </w:pPr>
-            <w:r>
-              <w:rPr>
-                <w:lang w:val="en-ZA"/>
-              </w:rPr>
+            <w:tcW w:w="0" w:type="auto"/>
+            <w:hideMark/>
+          </w:tcPr>
+          <w:p>
+            <w:r>
+              <w:t>Concrete Composite</w:t>
+            </w:r>
+          </w:p>
+        </w:tc>
+        <w:tc>
+          <w:tcPr>
+            <w:tcW w:w="0" w:type="auto"/>
+            <w:hideMark/>
+          </w:tcPr>
+          <w:p>
+            <w:proofErr w:type="spellStart"/>
+            <w:r>
+              <w:t>FrontendPhase</w:t>
+            </w:r>
+            <w:proofErr w:type="spellEnd"/>
+          </w:p>
+        </w:tc>
+        <w:tc>
+          <w:tcPr>
+            <w:tcW w:w="0" w:type="auto"/>
+            <w:hideMark/>
+          </w:tcPr>
+          <w:p>
+            <w:r>
+              <w:t>Contains frontend-related tasks.</w:t>
+            </w:r>
+          </w:p>
+        </w:tc>
+      </w:tr>
+      <w:tr>
+        <w:tc>
+          <w:tcPr>
+            <w:tcW w:w="0" w:type="auto"/>
+            <w:hideMark/>
+          </w:tcPr>
+          <w:p>
+            <w:r>
+              <w:t>Concrete Composite</w:t>
+            </w:r>
+          </w:p>
+        </w:tc>
+        <w:tc>
+          <w:tcPr>
+            <w:tcW w:w="0" w:type="auto"/>
+            <w:hideMark/>
+          </w:tcPr>
+          <w:p>
+            <w:proofErr w:type="spellStart"/>
+            <w:r>
+              <w:t>BackendPhase</w:t>
+            </w:r>
+            <w:proofErr w:type="spellEnd"/>
+          </w:p>
+        </w:tc>
+        <w:tc>
+          <w:tcPr>
+            <w:tcW w:w="0" w:type="auto"/>
+            <w:hideMark/>
+          </w:tcPr>
+          <w:p>
+            <w:r>
+              <w:t>Contains backend-related tasks.</w:t>
+            </w:r>
+          </w:p>
+        </w:tc>
+      </w:tr>
+      <w:tr>
+        <w:tc>
+          <w:tcPr>
+            <w:tcW w:w="0" w:type="auto"/>
+            <w:hideMark/>
+          </w:tcPr>
+          <w:p>
+            <w:r>
+              <w:t>Concrete Composite</w:t>
+            </w:r>
+          </w:p>
+        </w:tc>
+        <w:tc>
+          <w:tcPr>
+            <w:tcW w:w="0" w:type="auto"/>
+            <w:hideMark/>
+          </w:tcPr>
+          <w:p>
+            <w:proofErr w:type="spellStart"/>
+            <w:r>
+              <w:t>TestingPhase</w:t>
+            </w:r>
+            <w:proofErr w:type="spellEnd"/>
+          </w:p>
+        </w:tc>
+        <w:tc>
+          <w:tcPr>
+            <w:tcW w:w="0" w:type="auto"/>
+            <w:hideMark/>
+          </w:tcPr>
+          <w:p>
+            <w:r>
+              <w:t>Can contain testing sub-phases.</w:t>
+            </w:r>
+          </w:p>
+        </w:tc>
+      </w:tr>
+      <w:tr>
+        <w:tc>
+          <w:tcPr>
+            <w:tcW w:w="0" w:type="auto"/>
+            <w:hideMark/>
+          </w:tcPr>
+          <w:p>
+            <w:r>
               <w:t>Leaf</w:t>
             </w:r>
           </w:p>
         </w:tc>
         <w:tc>
           <w:tcPr>
-            <w:tcW w:w="3005" w:type="dxa"/>
-          </w:tcPr>
-          <w:p>
-            <w:pPr>
-              <w:rPr>
-                <w:lang w:val="en-ZA"/>
-              </w:rPr>
-            </w:pPr>
-            <w:r>
-              <w:rPr>
-                <w:lang w:val="en-ZA"/>
-              </w:rPr>
+            <w:tcW w:w="0" w:type="auto"/>
+            <w:hideMark/>
+          </w:tcPr>
+          <w:p>
+            <w:r>
               <w:t>DeliveryTask</w:t>
             </w:r>
           </w:p>
         </w:tc>
         <w:tc>
           <w:tcPr>
-            <w:tcW w:w="3006" w:type="dxa"/>
-          </w:tcPr>
-          <w:p>
-            <w:pPr>
-              <w:rPr>
-                <w:lang w:val="en-ZA"/>
-              </w:rPr>
-            </w:pPr>
-            <w:r>
-              <w:t>Represents an individual piece of work that must be completed.</w:t>
+            <w:tcW w:w="0" w:type="auto"/>
+            <w:hideMark/>
+          </w:tcPr>
+          <w:p>
+            <w:r>
+              <w:t>Represents an individual task that cannot contain children.</w:t>
+            </w:r>
+          </w:p>
+        </w:tc>
+      </w:tr>
+      <w:tr>
+        <w:tc>
+          <w:tcPr>
+            <w:tcW w:w="0" w:type="auto"/>
+            <w:hideMark/>
+          </w:tcPr>
+          <w:p>
+            <w:r>
+              <w:lastRenderedPageBreak/>
+              <w:t>Concrete Leaf</w:t>
+            </w:r>
+          </w:p>
+        </w:tc>
+        <w:tc>
+          <w:tcPr>
+            <w:tcW w:w="0" w:type="auto"/>
+            <w:hideMark/>
+          </w:tcPr>
+          <w:p>
+            <w:proofErr w:type="spellStart"/>
+            <w:r>
+              <w:t>LoginDesign</w:t>
+            </w:r>
+            <w:proofErr w:type="spellEnd"/>
+            <w:r>
+              <w:t xml:space="preserve">, </w:t>
+            </w:r>
+            <w:proofErr w:type="spellStart"/>
+            <w:r>
+              <w:t>LoginTesting</w:t>
+            </w:r>
+            <w:proofErr w:type="spellEnd"/>
+            <w:r>
+              <w:t xml:space="preserve">, </w:t>
+            </w:r>
+            <w:proofErr w:type="spellStart"/>
+            <w:r>
+              <w:t>DatabaseSetUp</w:t>
+            </w:r>
+            <w:proofErr w:type="spellEnd"/>
+            <w:r>
+              <w:t xml:space="preserve">, </w:t>
+            </w:r>
+            <w:proofErr w:type="spellStart"/>
+            <w:r>
+              <w:t>CreateAPI</w:t>
+            </w:r>
+            <w:proofErr w:type="spellEnd"/>
+            <w:r>
+              <w:t xml:space="preserve">, </w:t>
+            </w:r>
+            <w:proofErr w:type="spellStart"/>
+            <w:r>
+              <w:t>APITesting</w:t>
+            </w:r>
+            <w:proofErr w:type="spellEnd"/>
+          </w:p>
+        </w:tc>
+        <w:tc>
+          <w:tcPr>
+            <w:tcW w:w="0" w:type="auto"/>
+            <w:hideMark/>
+          </w:tcPr>
+          <w:p>
+            <w:r>
+              <w:t>Concrete TaskForge tasks.</w:t>
             </w:r>
           </w:p>
         </w:tc>
@@ -696,6 +835,387 @@
         <w:t>State</w:t>
       </w:r>
     </w:p>
+    <w:tbl>
+      <w:tblPr>
+        <w:tblStyle w:val="TableGrid"/>
+        <w:tblW w:w="0" w:type="auto"/>
+        <w:tblLook w:val="04A0" w:firstRow="1" w:lastRow="0" w:firstColumn="1" w:lastColumn="0" w:noHBand="0" w:noVBand="1"/>
+      </w:tblPr>
+      <w:tblGrid>
+        <w:gridCol w:w="2318"/>
+        <w:gridCol w:w="2221"/>
+        <w:gridCol w:w="4477"/>
+      </w:tblGrid>
+      <w:tr>
+        <w:tc>
+          <w:tcPr>
+            <w:tcW w:w="0" w:type="auto"/>
+            <w:hideMark/>
+          </w:tcPr>
+          <w:p>
+            <w:pPr>
+              <w:pStyle w:val="ListParagraph"/>
+              <w:spacing w:after="160" w:line="278" w:lineRule="auto"/>
+              <w:rPr>
+                <w:b/>
+                <w:bCs/>
+              </w:rPr>
+            </w:pPr>
+            <w:r>
+              <w:rPr>
+                <w:b/>
+                <w:bCs/>
+              </w:rPr>
+              <w:t>Participant Name</w:t>
+            </w:r>
+          </w:p>
+        </w:tc>
+        <w:tc>
+          <w:tcPr>
+            <w:tcW w:w="0" w:type="auto"/>
+            <w:hideMark/>
+          </w:tcPr>
+          <w:p>
+            <w:pPr>
+              <w:pStyle w:val="ListParagraph"/>
+              <w:spacing w:after="160" w:line="278" w:lineRule="auto"/>
+              <w:rPr>
+                <w:b/>
+                <w:bCs/>
+              </w:rPr>
+            </w:pPr>
+            <w:r>
+              <w:rPr>
+                <w:b/>
+                <w:bCs/>
+              </w:rPr>
+              <w:t>Class</w:t>
+            </w:r>
+          </w:p>
+        </w:tc>
+        <w:tc>
+          <w:tcPr>
+            <w:tcW w:w="0" w:type="auto"/>
+            <w:hideMark/>
+          </w:tcPr>
+          <w:p>
+            <w:pPr>
+              <w:pStyle w:val="ListParagraph"/>
+              <w:spacing w:after="160" w:line="278" w:lineRule="auto"/>
+              <w:rPr>
+                <w:b/>
+                <w:bCs/>
+              </w:rPr>
+            </w:pPr>
+            <w:r>
+              <w:rPr>
+                <w:b/>
+                <w:bCs/>
+              </w:rPr>
+              <w:t>Description</w:t>
+            </w:r>
+          </w:p>
+        </w:tc>
+      </w:tr>
+      <w:tr>
+        <w:tc>
+          <w:tcPr>
+            <w:tcW w:w="0" w:type="auto"/>
+            <w:hideMark/>
+          </w:tcPr>
+          <w:p>
+            <w:pPr>
+              <w:pStyle w:val="ListParagraph"/>
+              <w:spacing w:after="160" w:line="278" w:lineRule="auto"/>
+            </w:pPr>
+            <w:r>
+              <w:t>Context</w:t>
+            </w:r>
+          </w:p>
+        </w:tc>
+        <w:tc>
+          <w:tcPr>
+            <w:tcW w:w="0" w:type="auto"/>
+            <w:hideMark/>
+          </w:tcPr>
+          <w:p>
+            <w:pPr>
+              <w:pStyle w:val="ListParagraph"/>
+              <w:spacing w:after="160" w:line="278" w:lineRule="auto"/>
+            </w:pPr>
+            <w:r>
+              <w:t>DeliveryTask</w:t>
+            </w:r>
+          </w:p>
+        </w:tc>
+        <w:tc>
+          <w:tcPr>
+            <w:tcW w:w="0" w:type="auto"/>
+            <w:hideMark/>
+          </w:tcPr>
+          <w:p>
+            <w:pPr>
+              <w:pStyle w:val="ListParagraph"/>
+              <w:spacing w:after="160" w:line="278" w:lineRule="auto"/>
+            </w:pPr>
+            <w:r>
+              <w:t>Maintains the current state of a task and delegates state changes to the current State object.</w:t>
+            </w:r>
+          </w:p>
+        </w:tc>
+      </w:tr>
+      <w:tr>
+        <w:tc>
+          <w:tcPr>
+            <w:tcW w:w="0" w:type="auto"/>
+            <w:hideMark/>
+          </w:tcPr>
+          <w:p>
+            <w:pPr>
+              <w:pStyle w:val="ListParagraph"/>
+              <w:spacing w:after="160" w:line="278" w:lineRule="auto"/>
+            </w:pPr>
+            <w:r>
+              <w:t>State</w:t>
+            </w:r>
+          </w:p>
+        </w:tc>
+        <w:tc>
+          <w:tcPr>
+            <w:tcW w:w="0" w:type="auto"/>
+            <w:hideMark/>
+          </w:tcPr>
+          <w:p>
+            <w:pPr>
+              <w:pStyle w:val="ListParagraph"/>
+              <w:spacing w:after="160" w:line="278" w:lineRule="auto"/>
+            </w:pPr>
+            <w:r>
+              <w:t>State</w:t>
+            </w:r>
+          </w:p>
+        </w:tc>
+        <w:tc>
+          <w:tcPr>
+            <w:tcW w:w="0" w:type="auto"/>
+            <w:hideMark/>
+          </w:tcPr>
+          <w:p>
+            <w:pPr>
+              <w:pStyle w:val="ListParagraph"/>
+              <w:spacing w:after="160" w:line="278" w:lineRule="auto"/>
+            </w:pPr>
+            <w:r>
+              <w:t>Defines the interface for handling task state changes.</w:t>
+            </w:r>
+          </w:p>
+        </w:tc>
+      </w:tr>
+      <w:tr>
+        <w:tc>
+          <w:tcPr>
+            <w:tcW w:w="0" w:type="auto"/>
+            <w:hideMark/>
+          </w:tcPr>
+          <w:p>
+            <w:pPr>
+              <w:pStyle w:val="ListParagraph"/>
+              <w:spacing w:after="160" w:line="278" w:lineRule="auto"/>
+            </w:pPr>
+            <w:r>
+              <w:t>Concrete State</w:t>
+            </w:r>
+          </w:p>
+        </w:tc>
+        <w:tc>
+          <w:tcPr>
+            <w:tcW w:w="0" w:type="auto"/>
+            <w:hideMark/>
+          </w:tcPr>
+          <w:p>
+            <w:pPr>
+              <w:pStyle w:val="ListParagraph"/>
+              <w:spacing w:after="160" w:line="278" w:lineRule="auto"/>
+            </w:pPr>
+            <w:r>
+              <w:t>Planning</w:t>
+            </w:r>
+          </w:p>
+        </w:tc>
+        <w:tc>
+          <w:tcPr>
+            <w:tcW w:w="0" w:type="auto"/>
+            <w:hideMark/>
+          </w:tcPr>
+          <w:p>
+            <w:pPr>
+              <w:pStyle w:val="ListParagraph"/>
+              <w:spacing w:after="160" w:line="278" w:lineRule="auto"/>
+            </w:pPr>
+            <w:r>
+              <w:t>Handles transitions while a task is in the PLANNING state.</w:t>
+            </w:r>
+          </w:p>
+        </w:tc>
+      </w:tr>
+      <w:tr>
+        <w:tc>
+          <w:tcPr>
+            <w:tcW w:w="0" w:type="auto"/>
+            <w:hideMark/>
+          </w:tcPr>
+          <w:p>
+            <w:pPr>
+              <w:pStyle w:val="ListParagraph"/>
+              <w:spacing w:after="160" w:line="278" w:lineRule="auto"/>
+            </w:pPr>
+            <w:r>
+              <w:t>Concrete State</w:t>
+            </w:r>
+          </w:p>
+        </w:tc>
+        <w:tc>
+          <w:tcPr>
+            <w:tcW w:w="0" w:type="auto"/>
+            <w:hideMark/>
+          </w:tcPr>
+          <w:p>
+            <w:pPr>
+              <w:pStyle w:val="ListParagraph"/>
+              <w:spacing w:after="160" w:line="278" w:lineRule="auto"/>
+            </w:pPr>
+            <w:r>
+              <w:t>InProgress</w:t>
+            </w:r>
+          </w:p>
+        </w:tc>
+        <w:tc>
+          <w:tcPr>
+            <w:tcW w:w="0" w:type="auto"/>
+            <w:hideMark/>
+          </w:tcPr>
+          <w:p>
+            <w:pPr>
+              <w:pStyle w:val="ListParagraph"/>
+              <w:spacing w:after="160" w:line="278" w:lineRule="auto"/>
+            </w:pPr>
+            <w:r>
+              <w:t>Handles transitions while a task is INPROGRESS.</w:t>
+            </w:r>
+          </w:p>
+        </w:tc>
+      </w:tr>
+      <w:tr>
+        <w:tc>
+          <w:tcPr>
+            <w:tcW w:w="0" w:type="auto"/>
+            <w:hideMark/>
+          </w:tcPr>
+          <w:p>
+            <w:pPr>
+              <w:pStyle w:val="ListParagraph"/>
+              <w:spacing w:after="160" w:line="278" w:lineRule="auto"/>
+            </w:pPr>
+            <w:r>
+              <w:t>Concrete State</w:t>
+            </w:r>
+          </w:p>
+        </w:tc>
+        <w:tc>
+          <w:tcPr>
+            <w:tcW w:w="0" w:type="auto"/>
+            <w:hideMark/>
+          </w:tcPr>
+          <w:p>
+            <w:pPr>
+              <w:pStyle w:val="ListParagraph"/>
+              <w:spacing w:after="160" w:line="278" w:lineRule="auto"/>
+            </w:pPr>
+            <w:r>
+              <w:t>Delayed</w:t>
+            </w:r>
+          </w:p>
+        </w:tc>
+        <w:tc>
+          <w:tcPr>
+            <w:tcW w:w="0" w:type="auto"/>
+            <w:hideMark/>
+          </w:tcPr>
+          <w:p>
+            <w:pPr>
+              <w:pStyle w:val="ListParagraph"/>
+              <w:spacing w:after="160" w:line="278" w:lineRule="auto"/>
+            </w:pPr>
+            <w:r>
+              <w:t>Handles transitions while a task is DELAYED.</w:t>
+            </w:r>
+          </w:p>
+        </w:tc>
+      </w:tr>
+      <w:tr>
+        <w:tc>
+          <w:tcPr>
+            <w:tcW w:w="0" w:type="auto"/>
+            <w:hideMark/>
+          </w:tcPr>
+          <w:p>
+            <w:pPr>
+              <w:pStyle w:val="ListParagraph"/>
+              <w:spacing w:after="160" w:line="278" w:lineRule="auto"/>
+            </w:pPr>
+            <w:r>
+              <w:t>Concrete State</w:t>
+            </w:r>
+          </w:p>
+        </w:tc>
+        <w:tc>
+          <w:tcPr>
+            <w:tcW w:w="0" w:type="auto"/>
+            <w:hideMark/>
+          </w:tcPr>
+          <w:p>
+            <w:pPr>
+              <w:pStyle w:val="ListParagraph"/>
+              <w:spacing w:after="160" w:line="278" w:lineRule="auto"/>
+            </w:pPr>
+            <w:r>
+              <w:t>Completed</w:t>
+            </w:r>
+          </w:p>
+        </w:tc>
+        <w:tc>
+          <w:tcPr>
+            <w:tcW w:w="0" w:type="auto"/>
+            <w:hideMark/>
+          </w:tcPr>
+          <w:p>
+            <w:pPr>
+              <w:pStyle w:val="ListParagraph"/>
+              <w:spacing w:after="160" w:line="278" w:lineRule="auto"/>
+            </w:pPr>
+            <w:r>
+              <w:t>Represents a completed task and prevents invalid further transitions.</w:t>
+            </w:r>
+          </w:p>
+        </w:tc>
+      </w:tr>
+    </w:tbl>
+    <w:p>
+      <w:pPr>
+        <w:pStyle w:val="ListParagraph"/>
+        <w:rPr>
+          <w:lang w:val="en-ZA"/>
+        </w:rPr>
+      </w:pPr>
+    </w:p>
+    <w:p>
+      <w:pPr>
+        <w:pStyle w:val="ListParagraph"/>
+        <w:rPr>
+          <w:lang w:val="en-ZA"/>
+        </w:rPr>
+      </w:pPr>
+    </w:p>
     <w:p>
       <w:pPr>
         <w:pStyle w:val="ListParagraph"/>
@@ -714,6 +1234,286 @@
         <w:t xml:space="preserve">Iterator </w:t>
       </w:r>
     </w:p>
+    <w:tbl>
+      <w:tblPr>
+        <w:tblStyle w:val="TableGrid"/>
+        <w:tblW w:w="0" w:type="auto"/>
+        <w:tblLook w:val="04A0" w:firstRow="1" w:lastRow="0" w:firstColumn="1" w:lastColumn="0" w:noHBand="0" w:noVBand="1"/>
+      </w:tblPr>
+      <w:tblGrid>
+        <w:gridCol w:w="2161"/>
+        <w:gridCol w:w="2652"/>
+        <w:gridCol w:w="4203"/>
+      </w:tblGrid>
+      <w:tr>
+        <w:tc>
+          <w:tcPr>
+            <w:tcW w:w="0" w:type="auto"/>
+            <w:hideMark/>
+          </w:tcPr>
+          <w:p>
+            <w:pPr>
+              <w:spacing w:after="160" w:line="278" w:lineRule="auto"/>
+              <w:ind w:left="360"/>
+              <w:rPr>
+                <w:b/>
+                <w:bCs/>
+              </w:rPr>
+            </w:pPr>
+            <w:r>
+              <w:rPr>
+                <w:b/>
+                <w:bCs/>
+              </w:rPr>
+              <w:t>Participant Name</w:t>
+            </w:r>
+          </w:p>
+        </w:tc>
+        <w:tc>
+          <w:tcPr>
+            <w:tcW w:w="0" w:type="auto"/>
+            <w:hideMark/>
+          </w:tcPr>
+          <w:p>
+            <w:pPr>
+              <w:spacing w:after="160" w:line="278" w:lineRule="auto"/>
+              <w:ind w:left="360"/>
+              <w:rPr>
+                <w:b/>
+                <w:bCs/>
+              </w:rPr>
+            </w:pPr>
+            <w:r>
+              <w:rPr>
+                <w:b/>
+                <w:bCs/>
+              </w:rPr>
+              <w:t>Class</w:t>
+            </w:r>
+          </w:p>
+        </w:tc>
+        <w:tc>
+          <w:tcPr>
+            <w:tcW w:w="0" w:type="auto"/>
+            <w:hideMark/>
+          </w:tcPr>
+          <w:p>
+            <w:pPr>
+              <w:spacing w:after="160" w:line="278" w:lineRule="auto"/>
+              <w:ind w:left="360"/>
+              <w:rPr>
+                <w:b/>
+                <w:bCs/>
+              </w:rPr>
+            </w:pPr>
+            <w:r>
+              <w:rPr>
+                <w:b/>
+                <w:bCs/>
+              </w:rPr>
+              <w:t>Description</w:t>
+            </w:r>
+          </w:p>
+        </w:tc>
+      </w:tr>
+      <w:tr>
+        <w:tc>
+          <w:tcPr>
+            <w:tcW w:w="0" w:type="auto"/>
+            <w:hideMark/>
+          </w:tcPr>
+          <w:p>
+            <w:pPr>
+              <w:spacing w:after="160" w:line="278" w:lineRule="auto"/>
+              <w:ind w:left="360"/>
+            </w:pPr>
+            <w:r>
+              <w:t>Iterator</w:t>
+            </w:r>
+          </w:p>
+        </w:tc>
+        <w:tc>
+          <w:tcPr>
+            <w:tcW w:w="0" w:type="auto"/>
+            <w:hideMark/>
+          </w:tcPr>
+          <w:p>
+            <w:pPr>
+              <w:spacing w:after="160" w:line="278" w:lineRule="auto"/>
+              <w:ind w:left="360"/>
+            </w:pPr>
+            <w:r>
+              <w:t>Iterator</w:t>
+            </w:r>
+          </w:p>
+        </w:tc>
+        <w:tc>
+          <w:tcPr>
+            <w:tcW w:w="0" w:type="auto"/>
+            <w:hideMark/>
+          </w:tcPr>
+          <w:p>
+            <w:pPr>
+              <w:spacing w:after="160" w:line="278" w:lineRule="auto"/>
+              <w:ind w:left="360"/>
+            </w:pPr>
+            <w:r>
+              <w:t>Defines the interface for traversing TaskForge components.</w:t>
+            </w:r>
+          </w:p>
+        </w:tc>
+      </w:tr>
+      <w:tr>
+        <w:tc>
+          <w:tcPr>
+            <w:tcW w:w="0" w:type="auto"/>
+            <w:hideMark/>
+          </w:tcPr>
+          <w:p>
+            <w:pPr>
+              <w:spacing w:after="160" w:line="278" w:lineRule="auto"/>
+              <w:ind w:left="360"/>
+            </w:pPr>
+            <w:r>
+              <w:t>Concrete Iterator</w:t>
+            </w:r>
+          </w:p>
+        </w:tc>
+        <w:tc>
+          <w:tcPr>
+            <w:tcW w:w="0" w:type="auto"/>
+            <w:hideMark/>
+          </w:tcPr>
+          <w:p>
+            <w:pPr>
+              <w:spacing w:after="160" w:line="278" w:lineRule="auto"/>
+              <w:ind w:left="360"/>
+            </w:pPr>
+            <w:r>
+              <w:t>DepthFirstIterator</w:t>
+            </w:r>
+          </w:p>
+        </w:tc>
+        <w:tc>
+          <w:tcPr>
+            <w:tcW w:w="0" w:type="auto"/>
+            <w:hideMark/>
+          </w:tcPr>
+          <w:p>
+            <w:pPr>
+              <w:spacing w:after="160" w:line="278" w:lineRule="auto"/>
+              <w:ind w:left="360"/>
+            </w:pPr>
+            <w:r>
+              <w:t>Traverses the hierarchy depth-first using a stack.</w:t>
+            </w:r>
+          </w:p>
+        </w:tc>
+      </w:tr>
+      <w:tr>
+        <w:tc>
+          <w:tcPr>
+            <w:tcW w:w="0" w:type="auto"/>
+            <w:hideMark/>
+          </w:tcPr>
+          <w:p>
+            <w:pPr>
+              <w:spacing w:after="160" w:line="278" w:lineRule="auto"/>
+              <w:ind w:left="360"/>
+            </w:pPr>
+            <w:r>
+              <w:t>Concrete Iterator</w:t>
+            </w:r>
+          </w:p>
+        </w:tc>
+        <w:tc>
+          <w:tcPr>
+            <w:tcW w:w="0" w:type="auto"/>
+            <w:hideMark/>
+          </w:tcPr>
+          <w:p>
+            <w:pPr>
+              <w:spacing w:after="160" w:line="278" w:lineRule="auto"/>
+              <w:ind w:left="360"/>
+            </w:pPr>
+            <w:r>
+              <w:t>BreadthFirstIterator</w:t>
+            </w:r>
+          </w:p>
+        </w:tc>
+        <w:tc>
+          <w:tcPr>
+            <w:tcW w:w="0" w:type="auto"/>
+            <w:hideMark/>
+          </w:tcPr>
+          <w:p>
+            <w:pPr>
+              <w:spacing w:after="160" w:line="278" w:lineRule="auto"/>
+              <w:ind w:left="360"/>
+            </w:pPr>
+            <w:r>
+              <w:t>Traverses the hierarchy breadth-first using a queue.</w:t>
+            </w:r>
+          </w:p>
+        </w:tc>
+      </w:tr>
+      <w:tr>
+        <w:tc>
+          <w:tcPr>
+            <w:tcW w:w="0" w:type="auto"/>
+            <w:hideMark/>
+          </w:tcPr>
+          <w:p>
+            <w:pPr>
+              <w:spacing w:after="160" w:line="278" w:lineRule="auto"/>
+              <w:ind w:left="360"/>
+            </w:pPr>
+            <w:r>
+              <w:lastRenderedPageBreak/>
+              <w:t>Traversed Component</w:t>
+            </w:r>
+          </w:p>
+        </w:tc>
+        <w:tc>
+          <w:tcPr>
+            <w:tcW w:w="0" w:type="auto"/>
+            <w:hideMark/>
+          </w:tcPr>
+          <w:p>
+            <w:pPr>
+              <w:spacing w:after="160" w:line="278" w:lineRule="auto"/>
+              <w:ind w:left="360"/>
+            </w:pPr>
+            <w:r>
+              <w:t>DeliveryComponent</w:t>
+            </w:r>
+          </w:p>
+        </w:tc>
+        <w:tc>
+          <w:tcPr>
+            <w:tcW w:w="0" w:type="auto"/>
+            <w:hideMark/>
+          </w:tcPr>
+          <w:p>
+            <w:pPr>
+              <w:spacing w:after="160" w:line="278" w:lineRule="auto"/>
+              <w:ind w:left="360"/>
+            </w:pPr>
+            <w:r>
+              <w:t>Provides child-access operations used by the iterators to traverse the hierarchy.</w:t>
+            </w:r>
+          </w:p>
+        </w:tc>
+      </w:tr>
+    </w:tbl>
+    <w:p>
+      <w:pPr>
+        <w:ind w:left="360"/>
+        <w:rPr>
+          <w:lang w:val="en-ZA"/>
+        </w:rPr>
+      </w:pPr>
+    </w:p>
     <w:p>
       <w:pPr>
         <w:pStyle w:val="ListParagraph"/>
@@ -731,6 +1531,272 @@
         </w:rPr>
         <w:t>Decorator</w:t>
       </w:r>
+    </w:p>
+    <w:tbl>
+      <w:tblPr>
+        <w:tblStyle w:val="TableGrid"/>
+        <w:tblW w:w="9360" w:type="dxa"/>
+        <w:tblLook w:val="04A0" w:firstRow="1" w:lastRow="0" w:firstColumn="1" w:lastColumn="0" w:noHBand="0" w:noVBand="1"/>
+      </w:tblPr>
+      <w:tblGrid>
+        <w:gridCol w:w="1938"/>
+        <w:gridCol w:w="2840"/>
+        <w:gridCol w:w="4582"/>
+      </w:tblGrid>
+      <w:tr>
+        <w:tc>
+          <w:tcPr>
+            <w:tcW w:w="0" w:type="auto"/>
+            <w:hideMark/>
+          </w:tcPr>
+          <w:p>
+            <w:pPr>
+              <w:rPr>
+                <w:b/>
+                <w:bCs/>
+              </w:rPr>
+            </w:pPr>
+            <w:r>
+              <w:rPr>
+                <w:b/>
+                <w:bCs/>
+              </w:rPr>
+              <w:t>Participant Name</w:t>
+            </w:r>
+          </w:p>
+        </w:tc>
+        <w:tc>
+          <w:tcPr>
+            <w:tcW w:w="0" w:type="auto"/>
+            <w:hideMark/>
+          </w:tcPr>
+          <w:p>
+            <w:pPr>
+              <w:rPr>
+                <w:b/>
+                <w:bCs/>
+              </w:rPr>
+            </w:pPr>
+            <w:r>
+              <w:rPr>
+                <w:b/>
+                <w:bCs/>
+              </w:rPr>
+              <w:t>Class</w:t>
+            </w:r>
+          </w:p>
+        </w:tc>
+        <w:tc>
+          <w:tcPr>
+            <w:tcW w:w="0" w:type="auto"/>
+            <w:hideMark/>
+          </w:tcPr>
+          <w:p>
+            <w:pPr>
+              <w:rPr>
+                <w:b/>
+                <w:bCs/>
+              </w:rPr>
+            </w:pPr>
+            <w:r>
+              <w:rPr>
+                <w:b/>
+                <w:bCs/>
+              </w:rPr>
+              <w:t>Description</w:t>
+            </w:r>
+          </w:p>
+        </w:tc>
+      </w:tr>
+      <w:tr>
+        <w:tc>
+          <w:tcPr>
+            <w:tcW w:w="0" w:type="auto"/>
+            <w:hideMark/>
+          </w:tcPr>
+          <w:p>
+            <w:r>
+              <w:t>Component</w:t>
+            </w:r>
+          </w:p>
+        </w:tc>
+        <w:tc>
+          <w:tcPr>
+            <w:tcW w:w="0" w:type="auto"/>
+            <w:hideMark/>
+          </w:tcPr>
+          <w:p>
+            <w:r>
+              <w:t>DeliveryComponent</w:t>
+            </w:r>
+          </w:p>
+        </w:tc>
+        <w:tc>
+          <w:tcPr>
+            <w:tcW w:w="0" w:type="auto"/>
+            <w:hideMark/>
+          </w:tcPr>
+          <w:p>
+            <w:r>
+              <w:t>Defines the interface shared by components and decorators.</w:t>
+            </w:r>
+          </w:p>
+        </w:tc>
+      </w:tr>
+      <w:tr>
+        <w:tc>
+          <w:tcPr>
+            <w:tcW w:w="0" w:type="auto"/>
+            <w:hideMark/>
+          </w:tcPr>
+          <w:p>
+            <w:r>
+              <w:t>Concrete Component</w:t>
+            </w:r>
+          </w:p>
+        </w:tc>
+        <w:tc>
+          <w:tcPr>
+            <w:tcW w:w="0" w:type="auto"/>
+            <w:hideMark/>
+          </w:tcPr>
+          <w:p>
+            <w:r>
+              <w:t xml:space="preserve">DeliveryPhase / </w:t>
+            </w:r>
+            <w:proofErr w:type="spellStart"/>
+            <w:r>
+              <w:t>FrontendPhase</w:t>
+            </w:r>
+            <w:proofErr w:type="spellEnd"/>
+          </w:p>
+        </w:tc>
+        <w:tc>
+          <w:tcPr>
+            <w:tcW w:w="0" w:type="auto"/>
+            <w:hideMark/>
+          </w:tcPr>
+          <w:p>
+            <w:r>
+              <w:t>Provides the original component being decorated.</w:t>
+            </w:r>
+          </w:p>
+        </w:tc>
+      </w:tr>
+      <w:tr>
+        <w:tc>
+          <w:tcPr>
+            <w:tcW w:w="0" w:type="auto"/>
+            <w:hideMark/>
+          </w:tcPr>
+          <w:p>
+            <w:r>
+              <w:t>Decorator</w:t>
+            </w:r>
+          </w:p>
+        </w:tc>
+        <w:tc>
+          <w:tcPr>
+            <w:tcW w:w="0" w:type="auto"/>
+            <w:hideMark/>
+          </w:tcPr>
+          <w:p>
+            <w:proofErr w:type="spellStart"/>
+            <w:r>
+              <w:t>DeliveryDecorator</w:t>
+            </w:r>
+            <w:proofErr w:type="spellEnd"/>
+          </w:p>
+        </w:tc>
+        <w:tc>
+          <w:tcPr>
+            <w:tcW w:w="0" w:type="auto"/>
+            <w:hideMark/>
+          </w:tcPr>
+          <w:p>
+            <w:r>
+              <w:t>Wraps a DeliveryComponent and forwards its operations.</w:t>
+            </w:r>
+          </w:p>
+        </w:tc>
+      </w:tr>
+      <w:tr>
+        <w:tc>
+          <w:tcPr>
+            <w:tcW w:w="0" w:type="auto"/>
+            <w:hideMark/>
+          </w:tcPr>
+          <w:p>
+            <w:r>
+              <w:t>Concrete Decorator</w:t>
+            </w:r>
+          </w:p>
+        </w:tc>
+        <w:tc>
+          <w:tcPr>
+            <w:tcW w:w="0" w:type="auto"/>
+            <w:hideMark/>
+          </w:tcPr>
+          <w:p>
+            <w:r>
+              <w:t>PriorityDecorator</w:t>
+            </w:r>
+          </w:p>
+        </w:tc>
+        <w:tc>
+          <w:tcPr>
+            <w:tcW w:w="0" w:type="auto"/>
+            <w:hideMark/>
+          </w:tcPr>
+          <w:p>
+            <w:r>
+              <w:t>Adds a priority value to the wrapped component.</w:t>
+            </w:r>
+          </w:p>
+        </w:tc>
+      </w:tr>
+      <w:tr>
+        <w:tc>
+          <w:tcPr>
+            <w:tcW w:w="0" w:type="auto"/>
+            <w:hideMark/>
+          </w:tcPr>
+          <w:p>
+            <w:r>
+              <w:t>Concrete Decorator</w:t>
+            </w:r>
+          </w:p>
+        </w:tc>
+        <w:tc>
+          <w:tcPr>
+            <w:tcW w:w="0" w:type="auto"/>
+            <w:hideMark/>
+          </w:tcPr>
+          <w:p>
+            <w:r>
+              <w:t>AuditDecorator</w:t>
+            </w:r>
+          </w:p>
+        </w:tc>
+        <w:tc>
+          <w:tcPr>
+            <w:tcW w:w="0" w:type="auto"/>
+            <w:hideMark/>
+          </w:tcPr>
+          <w:p>
+            <w:r>
+              <w:t>Adds logging of state-change attempts to the wrapped component.</w:t>
+            </w:r>
+          </w:p>
+        </w:tc>
+      </w:tr>
+    </w:tbl>
+    <w:p>
+      <w:pPr>
+        <w:rPr>
+          <w:lang w:val="en-ZA"/>
+        </w:rPr>
+      </w:pPr>
     </w:p>
     <w:p>
       <w:pPr>
@@ -824,6 +1890,7 @@
       <w:r>
         <w:rPr>
           <w:rFonts w:asciiTheme="minorHAnsi" w:eastAsiaTheme="minorHAnsi" w:hAnsiTheme="minorHAnsi" w:cstheme="minorBidi"/>
+          <w:noProof/>
           <w:color w:val="auto"/>
           <w:sz w:val="24"/>
           <w:szCs w:val="24"/>
@@ -926,6 +1993,9 @@
     <w:p/>
     <w:p>
       <w:r>
+        <w:rPr>
+          <w:noProof/>
+        </w:rPr>
         <w:drawing>
           <wp:anchor distT="0" distB="0" distL="114300" distR="114300" simplePos="0" relativeHeight="251658240" behindDoc="1" locked="0" layoutInCell="1" allowOverlap="1" wp14:anchorId="5A7C2DCF" wp14:editId="4B147980">
             <wp:simplePos x="0" y="0"/>
@@ -1753,6 +2823,7 @@
   <w:style w:type="paragraph" w:default="1" w:styleId="Normal">
     <w:name w:val="Normal"/>
     <w:qFormat/>
+    <w:rsid w:val="005F7ED9"/>
   </w:style>
   <w:style w:type="paragraph" w:styleId="Heading1">
     <w:name w:val="heading 1"/>
@@ -1955,7 +3026,6 @@
   <w:style w:type="character" w:default="1" w:styleId="DefaultParagraphFont">
     <w:name w:val="Default Paragraph Font"/>
     <w:uiPriority w:val="1"/>
-    <w:semiHidden/>
     <w:unhideWhenUsed/>
   </w:style>
   <w:style w:type="table" w:default="1" w:styleId="TableNormal">

</xml_diff>

<commit_message>
Added GDB and Valgrind check section
</commit_message>
<xml_diff>
--- a/COS214PRAC4_PDF.docx
+++ b/COS214PRAC4_PDF.docx
@@ -1661,8 +1661,13 @@
             <w:hideMark/>
           </w:tcPr>
           <w:p>
-            <w:r>
-              <w:t xml:space="preserve">DeliveryPhase / </w:t>
+            <w:proofErr w:type="spellStart"/>
+            <w:r>
+              <w:t>DeliveryPhase</w:t>
+            </w:r>
+            <w:proofErr w:type="spellEnd"/>
+            <w:r>
+              <w:t xml:space="preserve"> / </w:t>
             </w:r>
             <w:proofErr w:type="spellStart"/>
             <w:r>
@@ -2096,6 +2101,325 @@
         <w:pStyle w:val="Heading2"/>
       </w:pPr>
       <w:r>
+        <w:t xml:space="preserve">GDB investigation and </w:t>
+      </w:r>
+      <w:proofErr w:type="spellStart"/>
+      <w:r>
+        <w:t>Valgrind</w:t>
+      </w:r>
+      <w:proofErr w:type="spellEnd"/>
+      <w:r>
+        <w:t xml:space="preserve"> check</w:t>
+      </w:r>
+    </w:p>
+    <w:p>
+      <w:r>
+        <w:t xml:space="preserve">During the testing of the </w:t>
+      </w:r>
+      <w:proofErr w:type="spellStart"/>
+      <w:r>
+        <w:t>TaskForge</w:t>
+      </w:r>
+      <w:proofErr w:type="spellEnd"/>
+      <w:r>
+        <w:t xml:space="preserve"> system GDB was used to assist with diagnosing any bugs that were encountered. One such bug was a segmentation fault due to a function trying to access an attribute of a class that had no instantiated value. GDB was used to set a breakpoint at the function that caused the segment fault. This was rectified by adding an initial value to the attribute. Evidence of GDB usage:</w:t>
+      </w:r>
+    </w:p>
+    <w:p>
+      <w:r>
+        <w:rPr>
+          <w:noProof/>
+        </w:rPr>
+        <w:drawing>
+          <wp:inline distT="0" distB="0" distL="0" distR="0" wp14:anchorId="3EE71E0D" wp14:editId="6CB899D5">
+            <wp:extent cx="5731510" cy="1598930"/>
+            <wp:effectExtent l="0" t="0" r="2540" b="1270"/>
+            <wp:docPr id="495073310" name="Picture 2"/>
+            <wp:cNvGraphicFramePr>
+              <a:graphicFrameLocks xmlns:a="http://schemas.openxmlformats.org/drawingml/2006/main" noChangeAspect="1"/>
+            </wp:cNvGraphicFramePr>
+            <a:graphic xmlns:a="http://schemas.openxmlformats.org/drawingml/2006/main">
+              <a:graphicData uri="http://schemas.openxmlformats.org/drawingml/2006/picture">
+                <pic:pic xmlns:pic="http://schemas.openxmlformats.org/drawingml/2006/picture">
+                  <pic:nvPicPr>
+                    <pic:cNvPr id="495073310" name="Picture 495073310"/>
+                    <pic:cNvPicPr/>
+                  </pic:nvPicPr>
+                  <pic:blipFill>
+                    <a:blip r:embed="rId13" cstate="print">
+                      <a:extLst>
+                        <a:ext uri="{28A0092B-C50C-407E-A947-70E740481C1C}">
+                          <a14:useLocalDpi xmlns:a14="http://schemas.microsoft.com/office/drawing/2010/main" val="0"/>
+                        </a:ext>
+                      </a:extLst>
+                    </a:blip>
+                    <a:stretch>
+                      <a:fillRect/>
+                    </a:stretch>
+                  </pic:blipFill>
+                  <pic:spPr>
+                    <a:xfrm>
+                      <a:off x="0" y="0"/>
+                      <a:ext cx="5731510" cy="1598930"/>
+                    </a:xfrm>
+                    <a:prstGeom prst="rect">
+                      <a:avLst/>
+                    </a:prstGeom>
+                  </pic:spPr>
+                </pic:pic>
+              </a:graphicData>
+            </a:graphic>
+          </wp:inline>
+        </w:drawing>
+      </w:r>
+    </w:p>
+    <w:p>
+      <w:r>
+        <w:br w:type="page"/>
+      </w:r>
+    </w:p>
+    <w:p/>
+    <w:p>
+      <w:pPr>
+        <w:rPr>
+          <w:noProof/>
+        </w:rPr>
+      </w:pPr>
+      <w:r>
+        <w:t>The second bug that was encountered was an ownership double free bug, thus causing a segmentation fault. A class destructor was attempting to delete an object it did not have ownership over, thus when both destructors were called the object was deleted twice. This was diagnosed by back tracing after the program crashed and resolved by removing the delete statement from the class that did not own the object. Evidence of GDB usage:</w:t>
+      </w:r>
+      <w:r>
+        <w:rPr>
+          <w:noProof/>
+        </w:rPr>
+        <w:t xml:space="preserve"> </w:t>
+      </w:r>
+      <w:r>
+        <w:rPr>
+          <w:noProof/>
+        </w:rPr>
+        <w:drawing>
+          <wp:inline distT="0" distB="0" distL="0" distR="0" wp14:anchorId="66EE7821" wp14:editId="5F510632">
+            <wp:extent cx="5731510" cy="1697990"/>
+            <wp:effectExtent l="0" t="0" r="2540" b="0"/>
+            <wp:docPr id="370244162" name="Picture 3"/>
+            <wp:cNvGraphicFramePr>
+              <a:graphicFrameLocks xmlns:a="http://schemas.openxmlformats.org/drawingml/2006/main" noChangeAspect="1"/>
+            </wp:cNvGraphicFramePr>
+            <a:graphic xmlns:a="http://schemas.openxmlformats.org/drawingml/2006/main">
+              <a:graphicData uri="http://schemas.openxmlformats.org/drawingml/2006/picture">
+                <pic:pic xmlns:pic="http://schemas.openxmlformats.org/drawingml/2006/picture">
+                  <pic:nvPicPr>
+                    <pic:cNvPr id="370244162" name="Picture 370244162"/>
+                    <pic:cNvPicPr/>
+                  </pic:nvPicPr>
+                  <pic:blipFill>
+                    <a:blip r:embed="rId14" cstate="print">
+                      <a:extLst>
+                        <a:ext uri="{28A0092B-C50C-407E-A947-70E740481C1C}">
+                          <a14:useLocalDpi xmlns:a14="http://schemas.microsoft.com/office/drawing/2010/main" val="0"/>
+                        </a:ext>
+                      </a:extLst>
+                    </a:blip>
+                    <a:stretch>
+                      <a:fillRect/>
+                    </a:stretch>
+                  </pic:blipFill>
+                  <pic:spPr>
+                    <a:xfrm>
+                      <a:off x="0" y="0"/>
+                      <a:ext cx="5731510" cy="1697990"/>
+                    </a:xfrm>
+                    <a:prstGeom prst="rect">
+                      <a:avLst/>
+                    </a:prstGeom>
+                  </pic:spPr>
+                </pic:pic>
+              </a:graphicData>
+            </a:graphic>
+          </wp:inline>
+        </w:drawing>
+      </w:r>
+    </w:p>
+    <w:p>
+      <w:pPr>
+        <w:rPr>
+          <w:noProof/>
+        </w:rPr>
+      </w:pPr>
+    </w:p>
+    <w:p>
+      <w:r>
+        <w:t xml:space="preserve">After the Testing was completed and any bugs were rectified </w:t>
+      </w:r>
+      <w:proofErr w:type="spellStart"/>
+      <w:r>
+        <w:t>Valgrind</w:t>
+      </w:r>
+      <w:proofErr w:type="spellEnd"/>
+      <w:r>
+        <w:t xml:space="preserve"> was used to ensure proper memory management. Due to some of the earlier bugs and poor memory management there was memory leaks. After conducting a </w:t>
+      </w:r>
+      <w:proofErr w:type="spellStart"/>
+      <w:r>
+        <w:t>valgrind</w:t>
+      </w:r>
+      <w:proofErr w:type="spellEnd"/>
+      <w:r>
+        <w:t xml:space="preserve"> check the leaks were removed and correct memory management was seen throughout the system. Evidence of </w:t>
+      </w:r>
+      <w:proofErr w:type="spellStart"/>
+      <w:r>
+        <w:t>Valgrind</w:t>
+      </w:r>
+      <w:proofErr w:type="spellEnd"/>
+      <w:r>
+        <w:t xml:space="preserve"> usage:</w:t>
+      </w:r>
+    </w:p>
+    <w:p>
+      <w:r>
+        <w:rPr>
+          <w:noProof/>
+        </w:rPr>
+        <w:drawing>
+          <wp:inline distT="0" distB="0" distL="0" distR="0" wp14:anchorId="743CC34A" wp14:editId="443278CC">
+            <wp:extent cx="5731510" cy="1682115"/>
+            <wp:effectExtent l="0" t="0" r="2540" b="0"/>
+            <wp:docPr id="347592350" name="Picture 5"/>
+            <wp:cNvGraphicFramePr>
+              <a:graphicFrameLocks xmlns:a="http://schemas.openxmlformats.org/drawingml/2006/main" noChangeAspect="1"/>
+            </wp:cNvGraphicFramePr>
+            <a:graphic xmlns:a="http://schemas.openxmlformats.org/drawingml/2006/main">
+              <a:graphicData uri="http://schemas.openxmlformats.org/drawingml/2006/picture">
+                <pic:pic xmlns:pic="http://schemas.openxmlformats.org/drawingml/2006/picture">
+                  <pic:nvPicPr>
+                    <pic:cNvPr id="347592350" name="Picture 347592350"/>
+                    <pic:cNvPicPr/>
+                  </pic:nvPicPr>
+                  <pic:blipFill>
+                    <a:blip r:embed="rId15" cstate="print">
+                      <a:extLst>
+                        <a:ext uri="{28A0092B-C50C-407E-A947-70E740481C1C}">
+                          <a14:useLocalDpi xmlns:a14="http://schemas.microsoft.com/office/drawing/2010/main" val="0"/>
+                        </a:ext>
+                      </a:extLst>
+                    </a:blip>
+                    <a:stretch>
+                      <a:fillRect/>
+                    </a:stretch>
+                  </pic:blipFill>
+                  <pic:spPr>
+                    <a:xfrm>
+                      <a:off x="0" y="0"/>
+                      <a:ext cx="5731510" cy="1682115"/>
+                    </a:xfrm>
+                    <a:prstGeom prst="rect">
+                      <a:avLst/>
+                    </a:prstGeom>
+                  </pic:spPr>
+                </pic:pic>
+              </a:graphicData>
+            </a:graphic>
+          </wp:inline>
+        </w:drawing>
+      </w:r>
+    </w:p>
+    <w:p/>
+    <w:p>
+      <w:r>
+        <w:rPr>
+          <w:noProof/>
+        </w:rPr>
+        <w:drawing>
+          <wp:inline distT="0" distB="0" distL="0" distR="0" wp14:anchorId="0DD7E64F" wp14:editId="742B824B">
+            <wp:extent cx="5731510" cy="1713230"/>
+            <wp:effectExtent l="0" t="0" r="2540" b="1270"/>
+            <wp:docPr id="705659667" name="Picture 7"/>
+            <wp:cNvGraphicFramePr>
+              <a:graphicFrameLocks xmlns:a="http://schemas.openxmlformats.org/drawingml/2006/main" noChangeAspect="1"/>
+            </wp:cNvGraphicFramePr>
+            <a:graphic xmlns:a="http://schemas.openxmlformats.org/drawingml/2006/main">
+              <a:graphicData uri="http://schemas.openxmlformats.org/drawingml/2006/picture">
+                <pic:pic xmlns:pic="http://schemas.openxmlformats.org/drawingml/2006/picture">
+                  <pic:nvPicPr>
+                    <pic:cNvPr id="705659667" name="Picture 705659667"/>
+                    <pic:cNvPicPr/>
+                  </pic:nvPicPr>
+                  <pic:blipFill>
+                    <a:blip r:embed="rId16" cstate="print">
+                      <a:extLst>
+                        <a:ext uri="{28A0092B-C50C-407E-A947-70E740481C1C}">
+                          <a14:useLocalDpi xmlns:a14="http://schemas.microsoft.com/office/drawing/2010/main" val="0"/>
+                        </a:ext>
+                      </a:extLst>
+                    </a:blip>
+                    <a:stretch>
+                      <a:fillRect/>
+                    </a:stretch>
+                  </pic:blipFill>
+                  <pic:spPr>
+                    <a:xfrm>
+                      <a:off x="0" y="0"/>
+                      <a:ext cx="5731510" cy="1713230"/>
+                    </a:xfrm>
+                    <a:prstGeom prst="rect">
+                      <a:avLst/>
+                    </a:prstGeom>
+                  </pic:spPr>
+                </pic:pic>
+              </a:graphicData>
+            </a:graphic>
+          </wp:inline>
+        </w:drawing>
+      </w:r>
+    </w:p>
+    <w:p>
+      <w:r>
+        <w:lastRenderedPageBreak/>
+        <w:drawing>
+          <wp:inline distT="0" distB="0" distL="0" distR="0" wp14:anchorId="4068737A" wp14:editId="6E54E9C0">
+            <wp:extent cx="5731510" cy="1618615"/>
+            <wp:effectExtent l="0" t="0" r="2540" b="635"/>
+            <wp:docPr id="1284319273" name="Picture 1"/>
+            <wp:cNvGraphicFramePr>
+              <a:graphicFrameLocks xmlns:a="http://schemas.openxmlformats.org/drawingml/2006/main" noChangeAspect="1"/>
+            </wp:cNvGraphicFramePr>
+            <a:graphic xmlns:a="http://schemas.openxmlformats.org/drawingml/2006/main">
+              <a:graphicData uri="http://schemas.openxmlformats.org/drawingml/2006/picture">
+                <pic:pic xmlns:pic="http://schemas.openxmlformats.org/drawingml/2006/picture">
+                  <pic:nvPicPr>
+                    <pic:cNvPr id="1284319273" name=""/>
+                    <pic:cNvPicPr/>
+                  </pic:nvPicPr>
+                  <pic:blipFill>
+                    <a:blip r:embed="rId17"/>
+                    <a:stretch>
+                      <a:fillRect/>
+                    </a:stretch>
+                  </pic:blipFill>
+                  <pic:spPr>
+                    <a:xfrm>
+                      <a:off x="0" y="0"/>
+                      <a:ext cx="5731510" cy="1618615"/>
+                    </a:xfrm>
+                    <a:prstGeom prst="rect">
+                      <a:avLst/>
+                    </a:prstGeom>
+                  </pic:spPr>
+                </pic:pic>
+              </a:graphicData>
+            </a:graphic>
+          </wp:inline>
+        </w:drawing>
+      </w:r>
+    </w:p>
+    <w:p/>
+    <w:p>
+      <w:pPr>
+        <w:pStyle w:val="Heading2"/>
+      </w:pPr>
+      <w:r>
         <w:t xml:space="preserve">Work split and </w:t>
       </w:r>
       <w:r>
@@ -2227,7 +2551,7 @@
       <w:r>
         <w:t xml:space="preserve"> </w:t>
       </w:r>
-      <w:hyperlink r:id="rId13" w:history="1">
+      <w:hyperlink r:id="rId18" w:history="1">
         <w:r>
           <w:rPr>
             <w:rStyle w:val="Hyperlink"/>
@@ -2244,7 +2568,7 @@
       </w:pPr>
     </w:p>
     <w:sectPr>
-      <w:headerReference w:type="default" r:id="rId14"/>
+      <w:headerReference w:type="default" r:id="rId19"/>
       <w:pgSz w:w="11906" w:h="16838"/>
       <w:pgMar w:top="1440" w:right="1440" w:bottom="1440" w:left="1440" w:header="708" w:footer="708" w:gutter="0"/>
       <w:cols w:space="708"/>
@@ -3026,6 +3350,7 @@
   <w:style w:type="character" w:default="1" w:styleId="DefaultParagraphFont">
     <w:name w:val="Default Paragraph Font"/>
     <w:uiPriority w:val="1"/>
+    <w:semiHidden/>
     <w:unhideWhenUsed/>
   </w:style>
   <w:style w:type="table" w:default="1" w:styleId="TableNormal">

</xml_diff>